<commit_message>
Add app screenshots and embed them in the reports
Seven screenshots of the running app (seed 42, proposal defaults) in
docs/screenshots/. They replace the screenshot placeholders in
FINAL_REPORT.md, REPORT.md and the .docx (Figures 5.1, 5.2, Appendix A).

Co-Authored-By: Claude Opus 5.5 (1M context) <noreply@anthropic.com>
</commit_message>
<xml_diff>
--- a/docs/Automated College Timetable Generator - Final Report.docx
+++ b/docs/Automated College Timetable Generator - Final Report.docx
@@ -11700,7 +11700,38 @@
           <w:b w:val="0"/>
           <w:i w:val="0"/>
         </w:rPr>
-        <w:t>«Figure 5.1 — Screenshot of the application after a run: stat tiles, chart and timetable grid»</w:t>
+        <w:drawing>
+          <wp:inline xmlns:a="http://schemas.openxmlformats.org/drawingml/2006/main" xmlns:pic="http://schemas.openxmlformats.org/drawingml/2006/picture">
+            <wp:extent cx="4754880" cy="5717000"/>
+            <wp:docPr id="1" name="Picture 1"/>
+            <wp:cNvGraphicFramePr>
+              <a:graphicFrameLocks noChangeAspect="1"/>
+            </wp:cNvGraphicFramePr>
+            <a:graphic>
+              <a:graphicData uri="http://schemas.openxmlformats.org/drawingml/2006/picture">
+                <pic:pic>
+                  <pic:nvPicPr>
+                    <pic:cNvPr id="0" name="03-after-run.png"/>
+                    <pic:cNvPicPr/>
+                  </pic:nvPicPr>
+                  <pic:blipFill>
+                    <a:blip r:embed="rId11"/>
+                    <a:stretch>
+                      <a:fillRect/>
+                    </a:stretch>
+                  </pic:blipFill>
+                  <pic:spPr>
+                    <a:xfrm>
+                      <a:off x="0" y="0"/>
+                      <a:ext cx="4754880" cy="5717000"/>
+                    </a:xfrm>
+                    <a:prstGeom prst="rect"/>
+                  </pic:spPr>
+                </pic:pic>
+              </a:graphicData>
+            </a:graphic>
+          </wp:inline>
+        </w:drawing>
       </w:r>
     </w:p>
     <w:p>
@@ -16508,7 +16539,38 @@
           <w:b w:val="0"/>
           <w:i w:val="0"/>
         </w:rPr>
-        <w:t>«Figure 5.2 — Screenshot of the live chart for seed 42: hard violations and best fitness against generation»</w:t>
+        <w:drawing>
+          <wp:inline xmlns:a="http://schemas.openxmlformats.org/drawingml/2006/main" xmlns:pic="http://schemas.openxmlformats.org/drawingml/2006/picture">
+            <wp:extent cx="5486400" cy="2255178"/>
+            <wp:docPr id="2" name="Picture 2"/>
+            <wp:cNvGraphicFramePr>
+              <a:graphicFrameLocks noChangeAspect="1"/>
+            </wp:cNvGraphicFramePr>
+            <a:graphic>
+              <a:graphicData uri="http://schemas.openxmlformats.org/drawingml/2006/picture">
+                <pic:pic>
+                  <pic:nvPicPr>
+                    <pic:cNvPr id="0" name="04-convergence-chart.png"/>
+                    <pic:cNvPicPr/>
+                  </pic:nvPicPr>
+                  <pic:blipFill>
+                    <a:blip r:embed="rId12"/>
+                    <a:stretch>
+                      <a:fillRect/>
+                    </a:stretch>
+                  </pic:blipFill>
+                  <pic:spPr>
+                    <a:xfrm>
+                      <a:off x="0" y="0"/>
+                      <a:ext cx="5486400" cy="2255178"/>
+                    </a:xfrm>
+                    <a:prstGeom prst="rect"/>
+                  </pic:spPr>
+                </pic:pic>
+              </a:graphicData>
+            </a:graphic>
+          </wp:inline>
+        </w:drawing>
       </w:r>
     </w:p>
     <w:p>
@@ -17103,16 +17165,47 @@
           <w:p>
             <w:pPr>
               <w:spacing w:line="240" w:lineRule="auto" w:after="40"/>
-              <w:jc w:val="left"/>
-            </w:pPr>
-            <w:r>
-              <w:rPr>
-                <w:rFonts w:ascii="Times New Roman" w:hAnsi="Times New Roman"/>
-                <w:b w:val="0"/>
-                <w:i w:val="0"/>
-                <w:sz w:val="20"/>
-              </w:rPr>
-              <w:t>«Screenshot 1»</w:t>
+              <w:jc w:val="center"/>
+            </w:pPr>
+            <w:r>
+              <w:rPr>
+                <w:rFonts w:ascii="Times New Roman" w:hAnsi="Times New Roman"/>
+                <w:b w:val="0"/>
+                <w:i w:val="0"/>
+                <w:sz w:val="20"/>
+              </w:rPr>
+              <w:drawing>
+                <wp:inline xmlns:a="http://schemas.openxmlformats.org/drawingml/2006/main" xmlns:pic="http://schemas.openxmlformats.org/drawingml/2006/picture">
+                  <wp:extent cx="2743200" cy="1264444"/>
+                  <wp:docPr id="3" name="Picture 3"/>
+                  <wp:cNvGraphicFramePr>
+                    <a:graphicFrameLocks noChangeAspect="1"/>
+                  </wp:cNvGraphicFramePr>
+                  <a:graphic>
+                    <a:graphicData uri="http://schemas.openxmlformats.org/drawingml/2006/picture">
+                      <pic:pic>
+                        <pic:nvPicPr>
+                          <pic:cNvPr id="0" name="01-before-run.png"/>
+                          <pic:cNvPicPr/>
+                        </pic:nvPicPr>
+                        <pic:blipFill>
+                          <a:blip r:embed="rId13"/>
+                          <a:stretch>
+                            <a:fillRect/>
+                          </a:stretch>
+                        </pic:blipFill>
+                        <pic:spPr>
+                          <a:xfrm>
+                            <a:off x="0" y="0"/>
+                            <a:ext cx="2743200" cy="1264444"/>
+                          </a:xfrm>
+                          <a:prstGeom prst="rect"/>
+                        </pic:spPr>
+                      </pic:pic>
+                    </a:graphicData>
+                  </a:graphic>
+                </wp:inline>
+              </w:drawing>
             </w:r>
           </w:p>
         </w:tc>
@@ -17175,16 +17268,47 @@
           <w:p>
             <w:pPr>
               <w:spacing w:line="240" w:lineRule="auto" w:after="40"/>
-              <w:jc w:val="left"/>
-            </w:pPr>
-            <w:r>
-              <w:rPr>
-                <w:rFonts w:ascii="Times New Roman" w:hAnsi="Times New Roman"/>
-                <w:b w:val="0"/>
-                <w:i w:val="0"/>
-                <w:sz w:val="20"/>
-              </w:rPr>
-              <w:t>«Screenshot 2»</w:t>
+              <w:jc w:val="center"/>
+            </w:pPr>
+            <w:r>
+              <w:rPr>
+                <w:rFonts w:ascii="Times New Roman" w:hAnsi="Times New Roman"/>
+                <w:b w:val="0"/>
+                <w:i w:val="0"/>
+                <w:sz w:val="20"/>
+              </w:rPr>
+              <w:drawing>
+                <wp:inline xmlns:a="http://schemas.openxmlformats.org/drawingml/2006/main" xmlns:pic="http://schemas.openxmlformats.org/drawingml/2006/picture">
+                  <wp:extent cx="2743200" cy="1482047"/>
+                  <wp:docPr id="4" name="Picture 4"/>
+                  <wp:cNvGraphicFramePr>
+                    <a:graphicFrameLocks noChangeAspect="1"/>
+                  </wp:cNvGraphicFramePr>
+                  <a:graphic>
+                    <a:graphicData uri="http://schemas.openxmlformats.org/drawingml/2006/picture">
+                      <pic:pic>
+                        <pic:nvPicPr>
+                          <pic:cNvPr id="0" name="06-timetable-teacher.png"/>
+                          <pic:cNvPicPr/>
+                        </pic:nvPicPr>
+                        <pic:blipFill>
+                          <a:blip r:embed="rId14"/>
+                          <a:stretch>
+                            <a:fillRect/>
+                          </a:stretch>
+                        </pic:blipFill>
+                        <pic:spPr>
+                          <a:xfrm>
+                            <a:off x="0" y="0"/>
+                            <a:ext cx="2743200" cy="1482047"/>
+                          </a:xfrm>
+                          <a:prstGeom prst="rect"/>
+                        </pic:spPr>
+                      </pic:pic>
+                    </a:graphicData>
+                  </a:graphic>
+                </wp:inline>
+              </w:drawing>
             </w:r>
           </w:p>
         </w:tc>

</xml_diff>

<commit_message>
Switch final report from B.Sc. CSIT to BCA and fill in names
Cover, recommendation and approval pages now name the Faculty of Humanities
and Social Sciences and the Bachelor in Computer Application degree. Symbol
numbers and the supervisor (Mausam Pokhrel) are filled in. Chapter 2 is
tightened and the appendix folded into Section 5.1.1, so the .docx renders
at 25 pages and stays under 30 once the eight figures are drawn.

Co-Authored-By: Claude Opus 5.5 (1M context) <noreply@anthropic.com>
</commit_message>
<xml_diff>
--- a/docs/Automated College Timetable Generator - Final Report.docx
+++ b/docs/Automated College Timetable Generator - Final Report.docx
@@ -40,7 +40,7 @@
           <w:b/>
           <w:i w:val="0"/>
         </w:rPr>
-        <w:t>Institute of Science and Technology</w:t>
+        <w:t>Faculty of Humanities and Social Sciences</w:t>
       </w:r>
     </w:p>
     <w:p>
@@ -118,45 +118,10 @@
           <w:i w:val="0"/>
         </w:rPr>
         <w:br/>
-      </w:r>
-      <w:r>
-        <w:rPr>
-          <w:rFonts w:ascii="Times New Roman" w:hAnsi="Times New Roman"/>
-          <w:b w:val="0"/>
-          <w:i w:val="0"/>
-        </w:rPr>
         <w:t>Department of Computer Application</w:t>
-      </w:r>
-      <w:r>
-        <w:rPr>
-          <w:rFonts w:ascii="Times New Roman" w:hAnsi="Times New Roman"/>
-          <w:b w:val="0"/>
-          <w:i w:val="0"/>
-        </w:rPr>
         <w:br/>
-      </w:r>
-      <w:r>
-        <w:rPr>
-          <w:rFonts w:ascii="Times New Roman" w:hAnsi="Times New Roman"/>
-          <w:b w:val="0"/>
-          <w:i w:val="0"/>
-        </w:rPr>
         <w:t>Academia International College</w:t>
-      </w:r>
-      <w:r>
-        <w:rPr>
-          <w:rFonts w:ascii="Times New Roman" w:hAnsi="Times New Roman"/>
-          <w:b w:val="0"/>
-          <w:i w:val="0"/>
-        </w:rPr>
         <w:br/>
-      </w:r>
-      <w:r>
-        <w:rPr>
-          <w:rFonts w:ascii="Times New Roman" w:hAnsi="Times New Roman"/>
-          <w:b w:val="0"/>
-          <w:i w:val="0"/>
-        </w:rPr>
         <w:t>Gwarko, Lalitpur</w:t>
       </w:r>
     </w:p>
@@ -186,7 +151,7 @@
           <w:b w:val="0"/>
           <w:i/>
         </w:rPr>
-        <w:t>Bachelor of Science in Computer Science and Information Technology</w:t>
+        <w:t>Bachelor in Computer Application</w:t>
       </w:r>
       <w:r>
         <w:rPr>
@@ -224,30 +189,9 @@
           <w:i w:val="0"/>
         </w:rPr>
         <w:br/>
-      </w:r>
-      <w:r>
-        <w:rPr>
-          <w:rFonts w:ascii="Times New Roman" w:hAnsi="Times New Roman"/>
-          <w:b w:val="0"/>
-          <w:i w:val="0"/>
-        </w:rPr>
-        <w:t>Prajwal Basnet («symbol number»)</w:t>
-      </w:r>
-      <w:r>
-        <w:rPr>
-          <w:rFonts w:ascii="Times New Roman" w:hAnsi="Times New Roman"/>
-          <w:b w:val="0"/>
-          <w:i w:val="0"/>
-        </w:rPr>
+        <w:t>Prajwal Basnet (6-2-346-22-2021)</w:t>
         <w:br/>
-      </w:r>
-      <w:r>
-        <w:rPr>
-          <w:rFonts w:ascii="Times New Roman" w:hAnsi="Times New Roman"/>
-          <w:b w:val="0"/>
-          <w:i w:val="0"/>
-        </w:rPr>
-        <w:t>Shekhar Paudel («symbol number»)</w:t>
+        <w:t>Shekhar Paudel (6-2-346-30-2021)</w:t>
       </w:r>
     </w:p>
     <w:p>
@@ -282,14 +226,7 @@
           <w:i w:val="0"/>
         </w:rPr>
         <w:br/>
-      </w:r>
-      <w:r>
-        <w:rPr>
-          <w:rFonts w:ascii="Times New Roman" w:hAnsi="Times New Roman"/>
-          <w:b w:val="0"/>
-          <w:i w:val="0"/>
-        </w:rPr>
-        <w:t>«Supervisor Name»</w:t>
+        <w:t>Mausam Pokhrel</w:t>
       </w:r>
     </w:p>
     <w:p>
@@ -333,7 +270,7 @@
           <w:b/>
           <w:i w:val="0"/>
         </w:rPr>
-        <w:t>Institute of Science and Technology</w:t>
+        <w:t>Faculty of Humanities and Social Sciences</w:t>
       </w:r>
     </w:p>
     <w:p>
@@ -419,7 +356,7 @@
           <w:b w:val="0"/>
           <w:i w:val="0"/>
         </w:rPr>
-        <w:t xml:space="preserve"> in partial fulfilment of the requirements for the degree of Bachelor of Science in Computer Science and Information Technology be processed for evaluation.</w:t>
+        <w:t xml:space="preserve"> in partial fulfilment of the requirements for the degree of Bachelor in Computer Application be processed for evaluation.</w:t>
       </w:r>
     </w:p>
     <w:p/>
@@ -445,60 +382,21 @@
       </w:r>
     </w:p>
     <w:p>
+      <w:pPr>
+        <w:jc w:val="left"/>
+      </w:pPr>
       <w:r>
         <w:rPr>
           <w:rFonts w:ascii="Times New Roman" w:hAnsi="Times New Roman"/>
           <w:b w:val="0"/>
           <w:i w:val="0"/>
         </w:rPr>
-        <w:t>«Supervisor Name»</w:t>
-      </w:r>
-      <w:r>
-        <w:rPr>
-          <w:rFonts w:ascii="Times New Roman" w:hAnsi="Times New Roman"/>
-          <w:b w:val="0"/>
-          <w:i w:val="0"/>
-        </w:rPr>
+        <w:t>Mausam Pokhrel</w:t>
         <w:br/>
-      </w:r>
-      <w:r>
-        <w:rPr>
-          <w:rFonts w:ascii="Times New Roman" w:hAnsi="Times New Roman"/>
-          <w:b w:val="0"/>
-          <w:i w:val="0"/>
-        </w:rPr>
         <w:t>Supervisor</w:t>
-      </w:r>
-      <w:r>
-        <w:rPr>
-          <w:rFonts w:ascii="Times New Roman" w:hAnsi="Times New Roman"/>
-          <w:b w:val="0"/>
-          <w:i w:val="0"/>
-        </w:rPr>
         <w:br/>
-      </w:r>
-      <w:r>
-        <w:rPr>
-          <w:rFonts w:ascii="Times New Roman" w:hAnsi="Times New Roman"/>
-          <w:b w:val="0"/>
-          <w:i w:val="0"/>
-        </w:rPr>
         <w:t>Department of Computer Application</w:t>
-      </w:r>
-      <w:r>
-        <w:rPr>
-          <w:rFonts w:ascii="Times New Roman" w:hAnsi="Times New Roman"/>
-          <w:b w:val="0"/>
-          <w:i w:val="0"/>
-        </w:rPr>
         <w:br/>
-      </w:r>
-      <w:r>
-        <w:rPr>
-          <w:rFonts w:ascii="Times New Roman" w:hAnsi="Times New Roman"/>
-          <w:b w:val="0"/>
-          <w:i w:val="0"/>
-        </w:rPr>
         <w:t>Academia International College, Gwarko, Lalitpur</w:t>
       </w:r>
     </w:p>
@@ -543,7 +441,7 @@
           <w:b/>
           <w:i w:val="0"/>
         </w:rPr>
-        <w:t>Institute of Science and Technology</w:t>
+        <w:t>Faculty of Humanities and Social Sciences</w:t>
       </w:r>
     </w:p>
     <w:p>
@@ -629,7 +527,7 @@
           <w:b w:val="0"/>
           <w:i w:val="0"/>
         </w:rPr>
-        <w:t xml:space="preserve"> in partial fulfilment of the requirements for the degree of Bachelor of Science in Computer Science and Information Technology has been evaluated. In our opinion it is satisfactory in scope and quality as a project for the required degree.</w:t>
+        <w:t xml:space="preserve"> in partial fulfilment of the requirements for the degree of Bachelor in Computer Application has been evaluated. In our opinion it is satisfactory in scope and quality as a project for the required degree.</w:t>
       </w:r>
     </w:p>
     <w:p/>
@@ -668,7 +566,32 @@
                 <w:sz w:val="20"/>
               </w:rPr>
               <w:t>SIGNATURE of Supervisor</w:t>
-            </w:r>
+              <w:br/>
+              <w:t>…………………………</w:t>
+              <w:br/>
+              <w:t>Mausam Pokhrel</w:t>
+              <w:br/>
+              <w:t>Academia International College</w:t>
+              <w:br/>
+              <w:t>Gwarko, Lalitpur</w:t>
+            </w:r>
+          </w:p>
+        </w:tc>
+        <w:tc>
+          <w:tcPr>
+            <w:tcW w:type="dxa" w:w="4500"/>
+            <w:tcBorders>
+              <w:top w:val="single" w:sz="6" w:color="000000"/>
+              <w:left w:val="single" w:sz="6" w:color="000000"/>
+              <w:bottom w:val="single" w:sz="6" w:color="000000"/>
+              <w:right w:val="single" w:sz="6" w:color="000000"/>
+            </w:tcBorders>
+          </w:tcPr>
+          <w:p>
+            <w:pPr>
+              <w:spacing w:line="240" w:lineRule="auto" w:after="40"/>
+              <w:jc w:val="left"/>
+            </w:pPr>
             <w:r>
               <w:rPr>
                 <w:rFonts w:ascii="Times New Roman" w:hAnsi="Times New Roman"/>
@@ -676,185 +599,16 @@
                 <w:i w:val="0"/>
                 <w:sz w:val="20"/>
               </w:rPr>
+              <w:t>SIGNATURE of Coordinator</w:t>
               <w:br/>
-            </w:r>
-            <w:r>
-              <w:rPr>
-                <w:rFonts w:ascii="Times New Roman" w:hAnsi="Times New Roman"/>
-                <w:b w:val="0"/>
-                <w:i w:val="0"/>
-                <w:sz w:val="20"/>
-              </w:rPr>
               <w:t>…………………………</w:t>
-            </w:r>
-            <w:r>
-              <w:rPr>
-                <w:rFonts w:ascii="Times New Roman" w:hAnsi="Times New Roman"/>
-                <w:b w:val="0"/>
-                <w:i w:val="0"/>
-                <w:sz w:val="20"/>
-              </w:rPr>
               <w:br/>
-            </w:r>
-            <w:r>
-              <w:rPr>
-                <w:rFonts w:ascii="Times New Roman" w:hAnsi="Times New Roman"/>
-                <w:b w:val="0"/>
-                <w:i w:val="0"/>
-                <w:sz w:val="20"/>
-              </w:rPr>
-              <w:t>«Supervisor Name»</w:t>
-            </w:r>
-            <w:r>
-              <w:rPr>
-                <w:rFonts w:ascii="Times New Roman" w:hAnsi="Times New Roman"/>
-                <w:b w:val="0"/>
-                <w:i w:val="0"/>
-                <w:sz w:val="20"/>
-              </w:rPr>
+              <w:t>«Coordinator Name»</w:t>
               <w:br/>
-            </w:r>
-            <w:r>
-              <w:rPr>
-                <w:rFonts w:ascii="Times New Roman" w:hAnsi="Times New Roman"/>
-                <w:b w:val="0"/>
-                <w:i w:val="0"/>
-                <w:sz w:val="20"/>
-              </w:rPr>
+              <w:t>Co-ordinator</w:t>
+              <w:br/>
               <w:t>Academia International College</w:t>
-            </w:r>
-            <w:r>
-              <w:rPr>
-                <w:rFonts w:ascii="Times New Roman" w:hAnsi="Times New Roman"/>
-                <w:b w:val="0"/>
-                <w:i w:val="0"/>
-                <w:sz w:val="20"/>
-              </w:rPr>
               <w:br/>
-            </w:r>
-            <w:r>
-              <w:rPr>
-                <w:rFonts w:ascii="Times New Roman" w:hAnsi="Times New Roman"/>
-                <w:b w:val="0"/>
-                <w:i w:val="0"/>
-                <w:sz w:val="20"/>
-              </w:rPr>
-              <w:t>Gwarko, Lalitpur</w:t>
-            </w:r>
-          </w:p>
-        </w:tc>
-        <w:tc>
-          <w:tcPr>
-            <w:tcW w:type="dxa" w:w="4500"/>
-            <w:tcBorders>
-              <w:top w:val="single" w:sz="6" w:color="000000"/>
-              <w:left w:val="single" w:sz="6" w:color="000000"/>
-              <w:bottom w:val="single" w:sz="6" w:color="000000"/>
-              <w:right w:val="single" w:sz="6" w:color="000000"/>
-            </w:tcBorders>
-          </w:tcPr>
-          <w:p>
-            <w:pPr>
-              <w:spacing w:line="240" w:lineRule="auto" w:after="40"/>
-              <w:jc w:val="left"/>
-            </w:pPr>
-            <w:r>
-              <w:rPr>
-                <w:rFonts w:ascii="Times New Roman" w:hAnsi="Times New Roman"/>
-                <w:b w:val="0"/>
-                <w:i w:val="0"/>
-                <w:sz w:val="20"/>
-              </w:rPr>
-              <w:t>SIGNATURE of Coordinator</w:t>
-            </w:r>
-            <w:r>
-              <w:rPr>
-                <w:rFonts w:ascii="Times New Roman" w:hAnsi="Times New Roman"/>
-                <w:b w:val="0"/>
-                <w:i w:val="0"/>
-                <w:sz w:val="20"/>
-              </w:rPr>
-              <w:br/>
-            </w:r>
-            <w:r>
-              <w:rPr>
-                <w:rFonts w:ascii="Times New Roman" w:hAnsi="Times New Roman"/>
-                <w:b w:val="0"/>
-                <w:i w:val="0"/>
-                <w:sz w:val="20"/>
-              </w:rPr>
-              <w:t>…………………………</w:t>
-            </w:r>
-            <w:r>
-              <w:rPr>
-                <w:rFonts w:ascii="Times New Roman" w:hAnsi="Times New Roman"/>
-                <w:b w:val="0"/>
-                <w:i w:val="0"/>
-                <w:sz w:val="20"/>
-              </w:rPr>
-              <w:br/>
-            </w:r>
-            <w:r>
-              <w:rPr>
-                <w:rFonts w:ascii="Times New Roman" w:hAnsi="Times New Roman"/>
-                <w:b w:val="0"/>
-                <w:i w:val="0"/>
-                <w:sz w:val="20"/>
-              </w:rPr>
-              <w:t>«Coordinator Name»</w:t>
-            </w:r>
-            <w:r>
-              <w:rPr>
-                <w:rFonts w:ascii="Times New Roman" w:hAnsi="Times New Roman"/>
-                <w:b w:val="0"/>
-                <w:i w:val="0"/>
-                <w:sz w:val="20"/>
-              </w:rPr>
-              <w:br/>
-            </w:r>
-            <w:r>
-              <w:rPr>
-                <w:rFonts w:ascii="Times New Roman" w:hAnsi="Times New Roman"/>
-                <w:b w:val="0"/>
-                <w:i w:val="0"/>
-                <w:sz w:val="20"/>
-              </w:rPr>
-              <w:t>Co-ordinator</w:t>
-            </w:r>
-            <w:r>
-              <w:rPr>
-                <w:rFonts w:ascii="Times New Roman" w:hAnsi="Times New Roman"/>
-                <w:b w:val="0"/>
-                <w:i w:val="0"/>
-                <w:sz w:val="20"/>
-              </w:rPr>
-              <w:br/>
-            </w:r>
-            <w:r>
-              <w:rPr>
-                <w:rFonts w:ascii="Times New Roman" w:hAnsi="Times New Roman"/>
-                <w:b w:val="0"/>
-                <w:i w:val="0"/>
-                <w:sz w:val="20"/>
-              </w:rPr>
-              <w:t>Academia International College</w:t>
-            </w:r>
-            <w:r>
-              <w:rPr>
-                <w:rFonts w:ascii="Times New Roman" w:hAnsi="Times New Roman"/>
-                <w:b w:val="0"/>
-                <w:i w:val="0"/>
-                <w:sz w:val="20"/>
-              </w:rPr>
-              <w:br/>
-            </w:r>
-            <w:r>
-              <w:rPr>
-                <w:rFonts w:ascii="Times New Roman" w:hAnsi="Times New Roman"/>
-                <w:b w:val="0"/>
-                <w:i w:val="0"/>
-                <w:sz w:val="20"/>
-              </w:rPr>
               <w:t>Gwarko, Lalitpur</w:t>
             </w:r>
           </w:p>
@@ -884,7 +638,28 @@
                 <w:sz w:val="20"/>
               </w:rPr>
               <w:t>SIGNATURE of Internal Examiner</w:t>
-            </w:r>
+              <w:br/>
+              <w:t>…………………………</w:t>
+              <w:br/>
+              <w:t>Internal Examiner</w:t>
+            </w:r>
+          </w:p>
+        </w:tc>
+        <w:tc>
+          <w:tcPr>
+            <w:tcW w:type="dxa" w:w="4500"/>
+            <w:tcBorders>
+              <w:top w:val="single" w:sz="6" w:color="000000"/>
+              <w:left w:val="single" w:sz="6" w:color="000000"/>
+              <w:bottom w:val="single" w:sz="6" w:color="000000"/>
+              <w:right w:val="single" w:sz="6" w:color="000000"/>
+            </w:tcBorders>
+          </w:tcPr>
+          <w:p>
+            <w:pPr>
+              <w:spacing w:line="240" w:lineRule="auto" w:after="40"/>
+              <w:jc w:val="left"/>
+            </w:pPr>
             <w:r>
               <w:rPr>
                 <w:rFonts w:ascii="Times New Roman" w:hAnsi="Times New Roman"/>
@@ -892,95 +667,10 @@
                 <w:i w:val="0"/>
                 <w:sz w:val="20"/>
               </w:rPr>
+              <w:t>SIGNATURE of External Examiner</w:t>
               <w:br/>
-            </w:r>
-            <w:r>
-              <w:rPr>
-                <w:rFonts w:ascii="Times New Roman" w:hAnsi="Times New Roman"/>
-                <w:b w:val="0"/>
-                <w:i w:val="0"/>
-                <w:sz w:val="20"/>
-              </w:rPr>
               <w:t>…………………………</w:t>
-            </w:r>
-            <w:r>
-              <w:rPr>
-                <w:rFonts w:ascii="Times New Roman" w:hAnsi="Times New Roman"/>
-                <w:b w:val="0"/>
-                <w:i w:val="0"/>
-                <w:sz w:val="20"/>
-              </w:rPr>
               <w:br/>
-            </w:r>
-            <w:r>
-              <w:rPr>
-                <w:rFonts w:ascii="Times New Roman" w:hAnsi="Times New Roman"/>
-                <w:b w:val="0"/>
-                <w:i w:val="0"/>
-                <w:sz w:val="20"/>
-              </w:rPr>
-              <w:t>Internal Examiner</w:t>
-            </w:r>
-          </w:p>
-        </w:tc>
-        <w:tc>
-          <w:tcPr>
-            <w:tcW w:type="dxa" w:w="4500"/>
-            <w:tcBorders>
-              <w:top w:val="single" w:sz="6" w:color="000000"/>
-              <w:left w:val="single" w:sz="6" w:color="000000"/>
-              <w:bottom w:val="single" w:sz="6" w:color="000000"/>
-              <w:right w:val="single" w:sz="6" w:color="000000"/>
-            </w:tcBorders>
-          </w:tcPr>
-          <w:p>
-            <w:pPr>
-              <w:spacing w:line="240" w:lineRule="auto" w:after="40"/>
-              <w:jc w:val="left"/>
-            </w:pPr>
-            <w:r>
-              <w:rPr>
-                <w:rFonts w:ascii="Times New Roman" w:hAnsi="Times New Roman"/>
-                <w:b w:val="0"/>
-                <w:i w:val="0"/>
-                <w:sz w:val="20"/>
-              </w:rPr>
-              <w:t>SIGNATURE of External Examiner</w:t>
-            </w:r>
-            <w:r>
-              <w:rPr>
-                <w:rFonts w:ascii="Times New Roman" w:hAnsi="Times New Roman"/>
-                <w:b w:val="0"/>
-                <w:i w:val="0"/>
-                <w:sz w:val="20"/>
-              </w:rPr>
-              <w:br/>
-            </w:r>
-            <w:r>
-              <w:rPr>
-                <w:rFonts w:ascii="Times New Roman" w:hAnsi="Times New Roman"/>
-                <w:b w:val="0"/>
-                <w:i w:val="0"/>
-                <w:sz w:val="20"/>
-              </w:rPr>
-              <w:t>…………………………</w:t>
-            </w:r>
-            <w:r>
-              <w:rPr>
-                <w:rFonts w:ascii="Times New Roman" w:hAnsi="Times New Roman"/>
-                <w:b w:val="0"/>
-                <w:i w:val="0"/>
-                <w:sz w:val="20"/>
-              </w:rPr>
-              <w:br/>
-            </w:r>
-            <w:r>
-              <w:rPr>
-                <w:rFonts w:ascii="Times New Roman" w:hAnsi="Times New Roman"/>
-                <w:b w:val="0"/>
-                <w:i w:val="0"/>
-                <w:sz w:val="20"/>
-              </w:rPr>
               <w:t>External Examiner</w:t>
             </w:r>
           </w:p>
@@ -1011,7 +701,7 @@
           <w:b w:val="0"/>
           <w:i w:val="0"/>
         </w:rPr>
-        <w:t>We extend our heartfelt gratitude to «Supervisor Name», our supervisor at Academia International College, for the guidance, patience and technical scrutiny that shaped this project. The insistence that every performance claim be measured rather than asserted is the reason Chapter 5 reports seeded, reproducible measurements instead of an estimate.</w:t>
+        <w:t>We extend our heartfelt gratitude to Mausam Pokhrel, our supervisor at Academia International College, for the guidance, patience and technical scrutiny that shaped this project. The insistence that every performance claim be measured rather than asserted is the reason Chapter 5 reports seeded, reproducible measurements instead of an estimate.</w:t>
       </w:r>
     </w:p>
     <w:p>
@@ -1036,6 +726,9 @@
       </w:r>
     </w:p>
     <w:p>
+      <w:pPr>
+        <w:jc w:val="left"/>
+      </w:pPr>
       <w:r>
         <w:rPr>
           <w:rFonts w:ascii="Times New Roman" w:hAnsi="Times New Roman"/>
@@ -1050,14 +743,7 @@
           <w:b w:val="0"/>
           <w:i w:val="0"/>
         </w:rPr>
-        <w:t xml:space="preserve"> («symbol number»)</w:t>
-      </w:r>
-      <w:r>
-        <w:rPr>
-          <w:rFonts w:ascii="Times New Roman" w:hAnsi="Times New Roman"/>
-          <w:b w:val="0"/>
-          <w:i w:val="0"/>
-        </w:rPr>
+        <w:t xml:space="preserve"> (6-2-346-22-2021)</w:t>
         <w:br/>
       </w:r>
       <w:r>
@@ -1074,7 +760,7 @@
           <w:b w:val="0"/>
           <w:i w:val="0"/>
         </w:rPr>
-        <w:t xml:space="preserve"> («symbol number»)</w:t>
+        <w:t xml:space="preserve"> (6-2-346-30-2021)</w:t>
       </w:r>
     </w:p>
     <w:p>
@@ -3430,6 +3116,60 @@
         <w:gridCol w:w="1411"/>
         <w:gridCol w:w="7589"/>
       </w:tblGrid>
+      <w:tr>
+        <w:tc>
+          <w:tcPr>
+            <w:tcW w:type="dxa" w:w="1411"/>
+            <w:tcBorders>
+              <w:top w:val="single" w:sz="6" w:color="000000"/>
+              <w:left w:val="single" w:sz="6" w:color="000000"/>
+              <w:bottom w:val="single" w:sz="6" w:color="000000"/>
+              <w:right w:val="single" w:sz="6" w:color="000000"/>
+            </w:tcBorders>
+          </w:tcPr>
+          <w:p>
+            <w:pPr>
+              <w:spacing w:line="240" w:lineRule="auto" w:after="40"/>
+              <w:jc w:val="left"/>
+            </w:pPr>
+            <w:r>
+              <w:rPr>
+                <w:rFonts w:ascii="Times New Roman" w:hAnsi="Times New Roman"/>
+                <w:b/>
+                <w:i w:val="0"/>
+                <w:sz w:val="20"/>
+              </w:rPr>
+              <w:t>BCA</w:t>
+            </w:r>
+          </w:p>
+        </w:tc>
+        <w:tc>
+          <w:tcPr>
+            <w:tcW w:type="dxa" w:w="7589"/>
+            <w:tcBorders>
+              <w:top w:val="single" w:sz="6" w:color="000000"/>
+              <w:left w:val="single" w:sz="6" w:color="000000"/>
+              <w:bottom w:val="single" w:sz="6" w:color="000000"/>
+              <w:right w:val="single" w:sz="6" w:color="000000"/>
+            </w:tcBorders>
+          </w:tcPr>
+          <w:p>
+            <w:pPr>
+              <w:spacing w:line="240" w:lineRule="auto" w:after="40"/>
+              <w:jc w:val="left"/>
+            </w:pPr>
+            <w:r>
+              <w:rPr>
+                <w:rFonts w:ascii="Times New Roman" w:hAnsi="Times New Roman"/>
+                <w:b w:val="0"/>
+                <w:i w:val="0"/>
+                <w:sz w:val="20"/>
+              </w:rPr>
+              <w:t>Bachelor in Computer Application</w:t>
+            </w:r>
+          </w:p>
+        </w:tc>
+      </w:tr>
       <w:tr>
         <w:tc>
           <w:tcPr>
@@ -4956,7 +4696,7 @@
           <w:b w:val="0"/>
           <w:i w:val="0"/>
         </w:rPr>
-        <w:t>Candidate schedules grow exponentially with the sessions, and Even and Itai proved timetabling NP-hard [1]. Manual methods persist in Nepali colleges because commercial software is costly.</w:t>
+        <w:t>Candidate schedules grow exponentially with the sessions, and Even and Itai proved timetabling NP-hard [1].</w:t>
       </w:r>
     </w:p>
     <w:p>
@@ -5193,7 +4933,7 @@
           <w:b w:val="0"/>
           <w:i/>
         </w:rPr>
-        <w:t>FET</w:t>
+        <w:t xml:space="preserve">FET</w:t>
       </w:r>
       <w:r>
         <w:rPr>
@@ -5201,7 +4941,7 @@
           <w:b w:val="0"/>
           <w:i w:val="0"/>
         </w:rPr>
-        <w:t xml:space="preserve"> is an open-source heuristic scheduler with a large constraint vocabulary, but a desktop application with a dense interface. </w:t>
+        <w:t xml:space="preserve"> is an open-source desktop scheduler with a dense interface; </w:t>
       </w:r>
       <w:r>
         <w:rPr>
@@ -5209,7 +4949,7 @@
           <w:b w:val="0"/>
           <w:i/>
         </w:rPr>
-        <w:t>aSc TimeTables</w:t>
+        <w:t xml:space="preserve">aSc TimeTables</w:t>
       </w:r>
       <w:r>
         <w:rPr>
@@ -5217,7 +4957,7 @@
           <w:b w:val="0"/>
           <w:i w:val="0"/>
         </w:rPr>
-        <w:t xml:space="preserve"> is a mature commercial product, but costly for a Nepali college and school-oriented. </w:t>
+        <w:t xml:space="preserve"> is commercial, costly and school-oriented; </w:t>
       </w:r>
       <w:r>
         <w:rPr>
@@ -5225,7 +4965,7 @@
           <w:b w:val="0"/>
           <w:i/>
         </w:rPr>
-        <w:t>UniTime</w:t>
+        <w:t xml:space="preserve">UniTime</w:t>
       </w:r>
       <w:r>
         <w:rPr>
@@ -5233,7 +4973,7 @@
           <w:b w:val="0"/>
           <w:i w:val="0"/>
         </w:rPr>
-        <w:t xml:space="preserve"> is a capable open-source university system whose deployment burden presumes a much larger institution.</w:t>
+        <w:t xml:space="preserve"> is an open-source university system whose deployment presumes a much larger institution.</w:t>
       </w:r>
     </w:p>
     <w:p>
@@ -11423,7 +11163,7 @@
           <w:b w:val="0"/>
           <w:i w:val="0"/>
         </w:rPr>
-        <w:t>. The genetic algorithm itself uses none of them.</w:t>
+        <w:t>. The genetic algorithm itself uses none of them. The system is started with npm install and npm run dev; npm test runs the ten tests.</w:t>
       </w:r>
     </w:p>
     <w:p>
@@ -17109,326 +16849,6 @@
           <w:i w:val="0"/>
         </w:rPr>
         <w:t>, vol. 37, no. 1, pp. 98–113, 1991.</w:t>
-      </w:r>
-    </w:p>
-    <w:p>
-      <w:pPr>
-        <w:pStyle w:val="Heading1"/>
-      </w:pPr>
-      <w:r>
-        <w:br w:type="page"/>
-      </w:r>
-      <w:r>
-        <w:rPr>
-          <w:rFonts w:ascii="Times New Roman" w:hAnsi="Times New Roman"/>
-          <w:b/>
-          <w:i w:val="0"/>
-        </w:rPr>
-        <w:t>APPENDIX</w:t>
-      </w:r>
-    </w:p>
-    <w:p>
-      <w:pPr>
-        <w:pStyle w:val="Heading2"/>
-      </w:pPr>
-      <w:r>
-        <w:rPr>
-          <w:rFonts w:ascii="Times New Roman" w:hAnsi="Times New Roman"/>
-          <w:b/>
-          <w:i w:val="0"/>
-        </w:rPr>
-        <w:t>Appendix A — Screenshots</w:t>
-      </w:r>
-    </w:p>
-    <w:tbl>
-      <w:tblPr>
-        <w:tblStyle w:val="TableGrid"/>
-        <w:tblW w:type="auto" w:w="0"/>
-        <w:jc w:val="center"/>
-        <w:tblLook w:firstColumn="1" w:firstRow="1" w:lastColumn="0" w:lastRow="0" w:noHBand="0" w:noVBand="1" w:val="04A0"/>
-      </w:tblPr>
-      <w:tblGrid>
-        <w:gridCol w:w="1702"/>
-        <w:gridCol w:w="7298"/>
-      </w:tblGrid>
-      <w:tr>
-        <w:tc>
-          <w:tcPr>
-            <w:tcW w:type="dxa" w:w="1702"/>
-            <w:tcBorders>
-              <w:top w:val="single" w:sz="6" w:color="000000"/>
-              <w:left w:val="single" w:sz="6" w:color="000000"/>
-              <w:bottom w:val="single" w:sz="6" w:color="000000"/>
-              <w:right w:val="single" w:sz="6" w:color="000000"/>
-            </w:tcBorders>
-          </w:tcPr>
-          <w:p>
-            <w:pPr>
-              <w:spacing w:line="240" w:lineRule="auto" w:after="40"/>
-              <w:jc w:val="center"/>
-            </w:pPr>
-            <w:r>
-              <w:rPr>
-                <w:rFonts w:ascii="Times New Roman" w:hAnsi="Times New Roman"/>
-                <w:b w:val="0"/>
-                <w:i w:val="0"/>
-                <w:sz w:val="20"/>
-              </w:rPr>
-              <w:drawing>
-                <wp:inline xmlns:a="http://schemas.openxmlformats.org/drawingml/2006/main" xmlns:pic="http://schemas.openxmlformats.org/drawingml/2006/picture">
-                  <wp:extent cx="2743200" cy="1264444"/>
-                  <wp:docPr id="3" name="Picture 3"/>
-                  <wp:cNvGraphicFramePr>
-                    <a:graphicFrameLocks noChangeAspect="1"/>
-                  </wp:cNvGraphicFramePr>
-                  <a:graphic>
-                    <a:graphicData uri="http://schemas.openxmlformats.org/drawingml/2006/picture">
-                      <pic:pic>
-                        <pic:nvPicPr>
-                          <pic:cNvPr id="0" name="01-before-run.png"/>
-                          <pic:cNvPicPr/>
-                        </pic:nvPicPr>
-                        <pic:blipFill>
-                          <a:blip r:embed="rId13"/>
-                          <a:stretch>
-                            <a:fillRect/>
-                          </a:stretch>
-                        </pic:blipFill>
-                        <pic:spPr>
-                          <a:xfrm>
-                            <a:off x="0" y="0"/>
-                            <a:ext cx="2743200" cy="1264444"/>
-                          </a:xfrm>
-                          <a:prstGeom prst="rect"/>
-                        </pic:spPr>
-                      </pic:pic>
-                    </a:graphicData>
-                  </a:graphic>
-                </wp:inline>
-              </w:drawing>
-            </w:r>
-          </w:p>
-        </w:tc>
-        <w:tc>
-          <w:tcPr>
-            <w:tcW w:type="dxa" w:w="7298"/>
-            <w:tcBorders>
-              <w:top w:val="single" w:sz="6" w:color="000000"/>
-              <w:left w:val="single" w:sz="6" w:color="000000"/>
-              <w:bottom w:val="single" w:sz="6" w:color="000000"/>
-              <w:right w:val="single" w:sz="6" w:color="000000"/>
-            </w:tcBorders>
-          </w:tcPr>
-          <w:p>
-            <w:pPr>
-              <w:spacing w:line="240" w:lineRule="auto" w:after="40"/>
-              <w:jc w:val="left"/>
-            </w:pPr>
-            <w:r>
-              <w:rPr>
-                <w:rFonts w:ascii="Times New Roman" w:hAnsi="Times New Roman"/>
-                <w:b w:val="0"/>
-                <w:i w:val="0"/>
-                <w:sz w:val="20"/>
-              </w:rPr>
-              <w:t xml:space="preserve">The page before a run — dataset summary, parameter fields and </w:t>
-            </w:r>
-            <w:r>
-              <w:rPr>
-                <w:rFonts w:ascii="Times New Roman" w:hAnsi="Times New Roman"/>
-                <w:b w:val="0"/>
-                <w:i/>
-                <w:sz w:val="20"/>
-              </w:rPr>
-              <w:t>Generate timetable</w:t>
-            </w:r>
-            <w:r>
-              <w:rPr>
-                <w:rFonts w:ascii="Times New Roman" w:hAnsi="Times New Roman"/>
-                <w:b w:val="0"/>
-                <w:i w:val="0"/>
-                <w:sz w:val="20"/>
-              </w:rPr>
-              <w:t xml:space="preserve"> button</w:t>
-            </w:r>
-          </w:p>
-        </w:tc>
-      </w:tr>
-      <w:tr>
-        <w:tc>
-          <w:tcPr>
-            <w:tcW w:type="dxa" w:w="1702"/>
-            <w:tcBorders>
-              <w:top w:val="single" w:sz="6" w:color="000000"/>
-              <w:left w:val="single" w:sz="6" w:color="000000"/>
-              <w:bottom w:val="single" w:sz="6" w:color="000000"/>
-              <w:right w:val="single" w:sz="6" w:color="000000"/>
-            </w:tcBorders>
-          </w:tcPr>
-          <w:p>
-            <w:pPr>
-              <w:spacing w:line="240" w:lineRule="auto" w:after="40"/>
-              <w:jc w:val="center"/>
-            </w:pPr>
-            <w:r>
-              <w:rPr>
-                <w:rFonts w:ascii="Times New Roman" w:hAnsi="Times New Roman"/>
-                <w:b w:val="0"/>
-                <w:i w:val="0"/>
-                <w:sz w:val="20"/>
-              </w:rPr>
-              <w:drawing>
-                <wp:inline xmlns:a="http://schemas.openxmlformats.org/drawingml/2006/main" xmlns:pic="http://schemas.openxmlformats.org/drawingml/2006/picture">
-                  <wp:extent cx="2743200" cy="1482047"/>
-                  <wp:docPr id="4" name="Picture 4"/>
-                  <wp:cNvGraphicFramePr>
-                    <a:graphicFrameLocks noChangeAspect="1"/>
-                  </wp:cNvGraphicFramePr>
-                  <a:graphic>
-                    <a:graphicData uri="http://schemas.openxmlformats.org/drawingml/2006/picture">
-                      <pic:pic>
-                        <pic:nvPicPr>
-                          <pic:cNvPr id="0" name="06-timetable-teacher.png"/>
-                          <pic:cNvPicPr/>
-                        </pic:nvPicPr>
-                        <pic:blipFill>
-                          <a:blip r:embed="rId14"/>
-                          <a:stretch>
-                            <a:fillRect/>
-                          </a:stretch>
-                        </pic:blipFill>
-                        <pic:spPr>
-                          <a:xfrm>
-                            <a:off x="0" y="0"/>
-                            <a:ext cx="2743200" cy="1482047"/>
-                          </a:xfrm>
-                          <a:prstGeom prst="rect"/>
-                        </pic:spPr>
-                      </pic:pic>
-                    </a:graphicData>
-                  </a:graphic>
-                </wp:inline>
-              </w:drawing>
-            </w:r>
-          </w:p>
-        </w:tc>
-        <w:tc>
-          <w:tcPr>
-            <w:tcW w:type="dxa" w:w="7298"/>
-            <w:tcBorders>
-              <w:top w:val="single" w:sz="6" w:color="000000"/>
-              <w:left w:val="single" w:sz="6" w:color="000000"/>
-              <w:bottom w:val="single" w:sz="6" w:color="000000"/>
-              <w:right w:val="single" w:sz="6" w:color="000000"/>
-            </w:tcBorders>
-          </w:tcPr>
-          <w:p>
-            <w:pPr>
-              <w:spacing w:line="240" w:lineRule="auto" w:after="40"/>
-              <w:jc w:val="left"/>
-            </w:pPr>
-            <w:r>
-              <w:rPr>
-                <w:rFonts w:ascii="Times New Roman" w:hAnsi="Times New Roman"/>
-                <w:b w:val="0"/>
-                <w:i w:val="0"/>
-                <w:sz w:val="20"/>
-              </w:rPr>
-              <w:t>Timetable, teacher view</w:t>
-            </w:r>
-          </w:p>
-        </w:tc>
-      </w:tr>
-    </w:tbl>
-    <w:p/>
-    <w:p>
-      <w:pPr>
-        <w:pStyle w:val="Heading2"/>
-      </w:pPr>
-      <w:r>
-        <w:rPr>
-          <w:rFonts w:ascii="Times New Roman" w:hAnsi="Times New Roman"/>
-          <w:b/>
-          <w:i w:val="0"/>
-        </w:rPr>
-        <w:t>Appendix B — Running the System</w:t>
-      </w:r>
-    </w:p>
-    <w:p>
-      <w:r>
-        <w:rPr>
-          <w:rFonts w:ascii="Times New Roman" w:hAnsi="Times New Roman"/>
-          <w:b w:val="0"/>
-          <w:i w:val="0"/>
-        </w:rPr>
-        <w:t xml:space="preserve">Run </w:t>
-      </w:r>
-      <w:r>
-        <w:rPr>
-          <w:rFonts w:ascii="Consolas" w:hAnsi="Consolas"/>
-          <w:b w:val="0"/>
-          <w:i w:val="0"/>
-          <w:sz w:val="22"/>
-        </w:rPr>
-        <w:t>npm install</w:t>
-      </w:r>
-      <w:r>
-        <w:rPr>
-          <w:rFonts w:ascii="Times New Roman" w:hAnsi="Times New Roman"/>
-          <w:b w:val="0"/>
-          <w:i w:val="0"/>
-        </w:rPr>
-        <w:t xml:space="preserve">, then </w:t>
-      </w:r>
-      <w:r>
-        <w:rPr>
-          <w:rFonts w:ascii="Consolas" w:hAnsi="Consolas"/>
-          <w:b w:val="0"/>
-          <w:i w:val="0"/>
-          <w:sz w:val="22"/>
-        </w:rPr>
-        <w:t>npm run dev</w:t>
-      </w:r>
-      <w:r>
-        <w:rPr>
-          <w:rFonts w:ascii="Times New Roman" w:hAnsi="Times New Roman"/>
-          <w:b w:val="0"/>
-          <w:i w:val="0"/>
-        </w:rPr>
-        <w:t xml:space="preserve"> and press </w:t>
-      </w:r>
-      <w:r>
-        <w:rPr>
-          <w:rFonts w:ascii="Times New Roman" w:hAnsi="Times New Roman"/>
-          <w:b w:val="0"/>
-          <w:i/>
-        </w:rPr>
-        <w:t>Generate timetable</w:t>
-      </w:r>
-      <w:r>
-        <w:rPr>
-          <w:rFonts w:ascii="Times New Roman" w:hAnsi="Times New Roman"/>
-          <w:b w:val="0"/>
-          <w:i w:val="0"/>
-        </w:rPr>
-        <w:t xml:space="preserve">; </w:t>
-      </w:r>
-      <w:r>
-        <w:rPr>
-          <w:rFonts w:ascii="Consolas" w:hAnsi="Consolas"/>
-          <w:b w:val="0"/>
-          <w:i w:val="0"/>
-          <w:sz w:val="22"/>
-        </w:rPr>
-        <w:t>npm test</w:t>
-      </w:r>
-      <w:r>
-        <w:rPr>
-          <w:rFonts w:ascii="Times New Roman" w:hAnsi="Times New Roman"/>
-          <w:b w:val="0"/>
-          <w:i w:val="0"/>
-        </w:rPr>
-        <w:t xml:space="preserve"> runs the ten tests. The default seed of 42 gives the same timetable every time.</w:t>
       </w:r>
     </w:p>
     <w:sectPr>

</xml_diff>